<commit_message>
feat(phase-5): resync tech reference to code + reduced-motion a11y
- generate-tech-doc.mjs + regenerated docx: correct three facts that lagged
  the code — Sentinel registry 97 -> 83 companies; Osiris physics schema
  v1.6-global -> v1.8-consumer-staples; jump vol "σ × 1.5 (Derived)" -> fixed
  jumpStd 0.07 (calibrated constant, per stochasticWorker).
- style.css: honour prefers-reduced-motion (Matrix/CSS animations +
  transitions). Rebuilt style.min.css + .map.

Co-Authored-By: Claude Opus 4.8 <noreply@anthropic.com>
</commit_message>
<xml_diff>
--- a/NovaSect_Technical_Reference.docx
+++ b/NovaSect_Technical_Reference.docx
@@ -2170,7 +2170,7 @@
           <w:szCs w:val="20"/>
           <w:rFonts w:ascii="Calibri" w:cs="Calibri" w:eastAsia="Calibri" w:hAnsi="Calibri"/>
         </w:rPr>
-        <w:t xml:space="preserve">The COMPANIES array in sentinel.v2.js holds 97 entries. Each entry carries: ticker, name, sector, credit type (IG/HY), rating, region, country, base_rate_type (UST/BUND/GILT), baseSpread (bps), marketBeta, sectorBeta, residual, lastVerified, netLeverage, and interestCoverage.</w:t>
+        <w:t xml:space="preserve">The COMPANIES array in sentinel.v2.js holds 83 entries. Each entry carries: ticker, name, sector, credit type (IG/HY), rating, region, country, base_rate_type (UST/BUND/GILT), baseSpread (bps), marketBeta, sectorBeta, residual, lastVerified, netLeverage, and interestCoverage.</w:t>
       </w:r>
     </w:p>
     <w:p>
@@ -6269,7 +6269,7 @@
           <w:szCs w:val="20"/>
           <w:rFonts w:ascii="Calibri" w:cs="Calibri" w:eastAsia="Calibri" w:hAnsi="Calibri"/>
         </w:rPr>
-        <w:t xml:space="preserve">Model parameters are stored in physics-config.json (schema v1.6-global) per ticker. Parameters requiring live market data — beta, dividend yield, and long-term mean price — are computed dynamically at simulation time by osirisIngestion.js.</w:t>
+        <w:t xml:space="preserve">Model parameters are stored in physics-config.json (schema v1.8-consumer-staples) per ticker. Parameters requiring live market data — beta, dividend yield, and long-term mean price — are computed dynamically at simulation time by osirisIngestion.js.</w:t>
       </w:r>
     </w:p>
     <w:p>
@@ -9465,7 +9465,7 @@
                 <w:szCs w:val="18"/>
                 <w:rFonts w:ascii="Calibri" w:cs="Calibri" w:eastAsia="Calibri" w:hAnsi="Calibri"/>
               </w:rPr>
-              <w:t xml:space="preserve">Jump vol = σ × 1.5</w:t>
+              <w:t xml:space="preserve">Jump vol (jumpStd), fixed 0.07 (7%)</w:t>
             </w:r>
           </w:p>
         </w:tc>
@@ -9487,7 +9487,7 @@
                 <w:szCs w:val="18"/>
                 <w:rFonts w:ascii="Calibri" w:cs="Calibri" w:eastAsia="Calibri" w:hAnsi="Calibri"/>
               </w:rPr>
-              <w:t xml:space="preserve">Derived</w:t>
+              <w:t xml:space="preserve">Calibrated constant</w:t>
             </w:r>
           </w:p>
         </w:tc>

</xml_diff>